<commit_message>
Dosyalar güncellendi ve yeni raporlar eklendi
</commit_message>
<xml_diff>
--- a/labs/lab02/report/_output/simulation-modeling-lab02-report.docx
+++ b/labs/lab02/report/_output/simulation-modeling-lab02-report.docx
@@ -2208,7 +2208,7 @@
       </w:r>
     </w:p>
     <w:bookmarkEnd w:id="34"/>
-    <w:bookmarkStart w:id="35" w:name="X789991b17b1277bab996829f1b8bf4273c07e69"/>
+    <w:bookmarkStart w:id="51" w:name="X789991b17b1277bab996829f1b8bf4273c07e69"/>
     <w:p>
       <w:pPr>
         <w:pStyle w:val="Heading1"/>
@@ -2225,48 +2225,362 @@
         <w:t xml:space="preserve">6.651143558300665</w:t>
       </w:r>
     </w:p>
+    <w:tbl>
+      <w:tblPr>
+        <w:tblStyle w:val="Table"/>
+        <w:tblW w:type="pct" w:w="5000"/>
+        <w:tblLayout w:type="fixed"/>
+        <w:tblLook w:firstRow="0" w:lastRow="0" w:firstColumn="0" w:lastColumn="0" w:noHBand="0" w:noVBand="0" w:val="0000"/>
+      </w:tblPr>
+      <w:tblGrid>
+        <w:gridCol w:w="7920"/>
+      </w:tblGrid>
+      <w:tr>
+        <w:tc>
+          <w:tcPr/>
+          <w:bookmarkStart w:id="38" w:name="fig-001"/>
+          <w:p>
+            <w:pPr>
+              <w:pStyle w:val="Compact"/>
+              <w:jc w:val="center"/>
+            </w:pPr>
+            <w:r>
+              <w:drawing>
+                <wp:inline>
+                  <wp:extent cx="3733800" cy="1432375"/>
+                  <wp:effectExtent b="0" l="0" r="0" t="0"/>
+                  <wp:docPr descr="" title="" id="36" name="Picture"/>
+                  <a:graphic>
+                    <a:graphicData uri="http://schemas.openxmlformats.org/drawingml/2006/picture">
+                      <pic:pic>
+                        <pic:nvPicPr>
+                          <pic:cNvPr descr="image/1.png" id="37" name="Picture"/>
+                          <pic:cNvPicPr>
+                            <a:picLocks noChangeArrowheads="1" noChangeAspect="1"/>
+                          </pic:cNvPicPr>
+                        </pic:nvPicPr>
+                        <pic:blipFill>
+                          <a:blip r:embed="rId35"/>
+                          <a:stretch>
+                            <a:fillRect/>
+                          </a:stretch>
+                        </pic:blipFill>
+                        <pic:spPr bwMode="auto">
+                          <a:xfrm>
+                            <a:off x="0" y="0"/>
+                            <a:ext cx="3733800" cy="1432375"/>
+                          </a:xfrm>
+                          <a:prstGeom prst="rect">
+                            <a:avLst/>
+                          </a:prstGeom>
+                          <a:noFill/>
+                          <a:ln w="9525">
+                            <a:noFill/>
+                            <a:headEnd/>
+                            <a:tailEnd/>
+                          </a:ln>
+                        </pic:spPr>
+                      </pic:pic>
+                    </a:graphicData>
+                  </a:graphic>
+                </wp:inline>
+              </w:drawing>
+            </w:r>
+          </w:p>
+          <w:p>
+            <w:pPr>
+              <w:jc w:val="center"/>
+            </w:pPr>
+            <w:pPr>
+              <w:jc w:val="left"/>
+              <w:spacing w:before="200"/>
+              <w:pStyle w:val="ImageCaption"/>
+            </w:pPr>
+            <w:r>
+              <w:t xml:space="preserve">Рисунок 1: Код модели</w:t>
+            </w:r>
+          </w:p>
+          <w:bookmarkEnd w:id="38"/>
+        </w:tc>
+      </w:tr>
+    </w:tbl>
     <w:p>
       <w:pPr>
         <w:pStyle w:val="BodyText"/>
       </w:pPr>
       <w:r>
-        <w:t xml:space="preserve">GRAFİK (</w:t>
-      </w:r>
-      <w:r>
-        <w:rPr>
-          <w:b/>
-          <w:bCs/>
-        </w:rPr>
-        <w:t xml:space="preserve">?@fig-001</w:t>
-      </w:r>
-      <w:r>
-        <w:t xml:space="preserve">).</w:t>
-      </w:r>
-    </w:p>
+        <w:t xml:space="preserve"> </w:t>
+      </w:r>
+    </w:p>
+    <w:tbl>
+      <w:tblPr>
+        <w:tblStyle w:val="Table"/>
+        <w:tblW w:type="pct" w:w="5000"/>
+        <w:tblLayout w:type="fixed"/>
+        <w:tblLook w:firstRow="0" w:lastRow="0" w:firstColumn="0" w:lastColumn="0" w:noHBand="0" w:noVBand="0" w:val="0000"/>
+      </w:tblPr>
+      <w:tblGrid>
+        <w:gridCol w:w="7920"/>
+      </w:tblGrid>
+      <w:tr>
+        <w:tc>
+          <w:tcPr/>
+          <w:bookmarkStart w:id="42" w:name="fig-003"/>
+          <w:p>
+            <w:pPr>
+              <w:pStyle w:val="Compact"/>
+              <w:jc w:val="center"/>
+            </w:pPr>
+            <w:r>
+              <w:drawing>
+                <wp:inline>
+                  <wp:extent cx="3733800" cy="1416655"/>
+                  <wp:effectExtent b="0" l="0" r="0" t="0"/>
+                  <wp:docPr descr="" title="" id="40" name="Picture"/>
+                  <a:graphic>
+                    <a:graphicData uri="http://schemas.openxmlformats.org/drawingml/2006/picture">
+                      <pic:pic>
+                        <pic:nvPicPr>
+                          <pic:cNvPr descr="image/2.png" id="41" name="Picture"/>
+                          <pic:cNvPicPr>
+                            <a:picLocks noChangeArrowheads="1" noChangeAspect="1"/>
+                          </pic:cNvPicPr>
+                        </pic:nvPicPr>
+                        <pic:blipFill>
+                          <a:blip r:embed="rId39"/>
+                          <a:stretch>
+                            <a:fillRect/>
+                          </a:stretch>
+                        </pic:blipFill>
+                        <pic:spPr bwMode="auto">
+                          <a:xfrm>
+                            <a:off x="0" y="0"/>
+                            <a:ext cx="3733800" cy="1416655"/>
+                          </a:xfrm>
+                          <a:prstGeom prst="rect">
+                            <a:avLst/>
+                          </a:prstGeom>
+                          <a:noFill/>
+                          <a:ln w="9525">
+                            <a:noFill/>
+                            <a:headEnd/>
+                            <a:tailEnd/>
+                          </a:ln>
+                        </pic:spPr>
+                      </pic:pic>
+                    </a:graphicData>
+                  </a:graphic>
+                </wp:inline>
+              </w:drawing>
+            </w:r>
+          </w:p>
+          <w:p>
+            <w:pPr>
+              <w:jc w:val="center"/>
+            </w:pPr>
+            <w:pPr>
+              <w:jc w:val="left"/>
+              <w:spacing w:before="200"/>
+              <w:pStyle w:val="ImageCaption"/>
+            </w:pPr>
+            <w:r>
+              <w:t xml:space="preserve">Рисунок 2: Параметры модели</w:t>
+            </w:r>
+          </w:p>
+          <w:bookmarkEnd w:id="42"/>
+        </w:tc>
+      </w:tr>
+    </w:tbl>
     <w:p>
       <w:pPr>
         <w:pStyle w:val="BodyText"/>
       </w:pPr>
       <w:r>
-        <w:t xml:space="preserve">(image/1.png){#fig-001 width=70%}</w:t>
-      </w:r>
-    </w:p>
+        <w:t xml:space="preserve"> </w:t>
+      </w:r>
+    </w:p>
+    <w:tbl>
+      <w:tblPr>
+        <w:tblStyle w:val="Table"/>
+        <w:tblW w:type="pct" w:w="5000"/>
+        <w:tblLayout w:type="fixed"/>
+        <w:tblLook w:firstRow="0" w:lastRow="0" w:firstColumn="0" w:lastColumn="0" w:noHBand="0" w:noVBand="0" w:val="0000"/>
+      </w:tblPr>
+      <w:tblGrid>
+        <w:gridCol w:w="7920"/>
+      </w:tblGrid>
+      <w:tr>
+        <w:tc>
+          <w:tcPr/>
+          <w:bookmarkStart w:id="46" w:name="fig-004"/>
+          <w:p>
+            <w:pPr>
+              <w:pStyle w:val="Compact"/>
+              <w:jc w:val="center"/>
+            </w:pPr>
+            <w:r>
+              <w:drawing>
+                <wp:inline>
+                  <wp:extent cx="3733800" cy="1513114"/>
+                  <wp:effectExtent b="0" l="0" r="0" t="0"/>
+                  <wp:docPr descr="" title="" id="44" name="Picture"/>
+                  <a:graphic>
+                    <a:graphicData uri="http://schemas.openxmlformats.org/drawingml/2006/picture">
+                      <pic:pic>
+                        <pic:nvPicPr>
+                          <pic:cNvPr descr="image/3.png" id="45" name="Picture"/>
+                          <pic:cNvPicPr>
+                            <a:picLocks noChangeArrowheads="1" noChangeAspect="1"/>
+                          </pic:cNvPicPr>
+                        </pic:nvPicPr>
+                        <pic:blipFill>
+                          <a:blip r:embed="rId43"/>
+                          <a:stretch>
+                            <a:fillRect/>
+                          </a:stretch>
+                        </pic:blipFill>
+                        <pic:spPr bwMode="auto">
+                          <a:xfrm>
+                            <a:off x="0" y="0"/>
+                            <a:ext cx="3733800" cy="1513114"/>
+                          </a:xfrm>
+                          <a:prstGeom prst="rect">
+                            <a:avLst/>
+                          </a:prstGeom>
+                          <a:noFill/>
+                          <a:ln w="9525">
+                            <a:noFill/>
+                            <a:headEnd/>
+                            <a:tailEnd/>
+                          </a:ln>
+                        </pic:spPr>
+                      </pic:pic>
+                    </a:graphicData>
+                  </a:graphic>
+                </wp:inline>
+              </w:drawing>
+            </w:r>
+          </w:p>
+          <w:p>
+            <w:pPr>
+              <w:jc w:val="center"/>
+            </w:pPr>
+            <w:pPr>
+              <w:jc w:val="left"/>
+              <w:spacing w:before="200"/>
+              <w:pStyle w:val="ImageCaption"/>
+            </w:pPr>
+            <w:r>
+              <w:t xml:space="preserve">Рисунок 3: Решение (случай 1)</w:t>
+            </w:r>
+          </w:p>
+          <w:bookmarkEnd w:id="46"/>
+        </w:tc>
+      </w:tr>
+    </w:tbl>
     <w:p>
       <w:pPr>
         <w:pStyle w:val="BodyText"/>
       </w:pPr>
       <w:r>
-        <w:t xml:space="preserve">GRAFİK (</w:t>
-      </w:r>
-      <w:r>
-        <w:rPr>
-          <w:b/>
-          <w:bCs/>
-        </w:rPr>
-        <w:t xml:space="preserve">?@fig-002</w:t>
-      </w:r>
-      <w:r>
-        <w:t xml:space="preserve">)</w:t>
+        <w:t xml:space="preserve"> </w:t>
+      </w:r>
+    </w:p>
+    <w:tbl>
+      <w:tblPr>
+        <w:tblStyle w:val="Table"/>
+        <w:tblW w:type="pct" w:w="5000"/>
+        <w:tblLayout w:type="fixed"/>
+        <w:tblLook w:firstRow="0" w:lastRow="0" w:firstColumn="0" w:lastColumn="0" w:noHBand="0" w:noVBand="0" w:val="0000"/>
+      </w:tblPr>
+      <w:tblGrid>
+        <w:gridCol w:w="7920"/>
+      </w:tblGrid>
+      <w:tr>
+        <w:tc>
+          <w:tcPr/>
+          <w:bookmarkStart w:id="50" w:name="fig-005"/>
+          <w:p>
+            <w:pPr>
+              <w:pStyle w:val="Compact"/>
+              <w:jc w:val="center"/>
+            </w:pPr>
+            <w:r>
+              <w:drawing>
+                <wp:inline>
+                  <wp:extent cx="3733800" cy="1381895"/>
+                  <wp:effectExtent b="0" l="0" r="0" t="0"/>
+                  <wp:docPr descr="" title="" id="48" name="Picture"/>
+                  <a:graphic>
+                    <a:graphicData uri="http://schemas.openxmlformats.org/drawingml/2006/picture">
+                      <pic:pic>
+                        <pic:nvPicPr>
+                          <pic:cNvPr descr="image/4.png" id="49" name="Picture"/>
+                          <pic:cNvPicPr>
+                            <a:picLocks noChangeArrowheads="1" noChangeAspect="1"/>
+                          </pic:cNvPicPr>
+                        </pic:nvPicPr>
+                        <pic:blipFill>
+                          <a:blip r:embed="rId47"/>
+                          <a:stretch>
+                            <a:fillRect/>
+                          </a:stretch>
+                        </pic:blipFill>
+                        <pic:spPr bwMode="auto">
+                          <a:xfrm>
+                            <a:off x="0" y="0"/>
+                            <a:ext cx="3733800" cy="1381895"/>
+                          </a:xfrm>
+                          <a:prstGeom prst="rect">
+                            <a:avLst/>
+                          </a:prstGeom>
+                          <a:noFill/>
+                          <a:ln w="9525">
+                            <a:noFill/>
+                            <a:headEnd/>
+                            <a:tailEnd/>
+                          </a:ln>
+                        </pic:spPr>
+                      </pic:pic>
+                    </a:graphicData>
+                  </a:graphic>
+                </wp:inline>
+              </w:drawing>
+            </w:r>
+          </w:p>
+          <w:p>
+            <w:pPr>
+              <w:jc w:val="center"/>
+            </w:pPr>
+            <w:pPr>
+              <w:jc w:val="left"/>
+              <w:spacing w:before="200"/>
+              <w:pStyle w:val="ImageCaption"/>
+            </w:pPr>
+            <w:r>
+              <w:t xml:space="preserve">Рисунок 4: Решение (случай 2)</w:t>
+            </w:r>
+          </w:p>
+          <w:bookmarkEnd w:id="50"/>
+        </w:tc>
+      </w:tr>
+    </w:tbl>
+    <w:bookmarkEnd w:id="51"/>
+    <w:bookmarkStart w:id="52" w:name="выводы"/>
+    <w:p>
+      <w:pPr>
+        <w:pStyle w:val="Heading1"/>
+      </w:pPr>
+      <w:r>
+        <w:t xml:space="preserve">18. Выводы</w:t>
+      </w:r>
+    </w:p>
+    <w:p>
+      <w:pPr>
+        <w:pStyle w:val="FirstParagraph"/>
+      </w:pPr>
+      <w:r>
+        <w:t xml:space="preserve">В процессе выполнения данной лабораторной работы я построила математическую модель для выбора правильной стратегии при решении примера задаче о погоне.</w:t>
       </w:r>
     </w:p>
     <w:p>
@@ -2274,84 +2588,6 @@
         <w:pStyle w:val="BodyText"/>
       </w:pPr>
       <w:r>
-        <w:t xml:space="preserve">(image/2.png){#fig-002 width=70%}</w:t>
-      </w:r>
-    </w:p>
-    <w:p>
-      <w:pPr>
-        <w:pStyle w:val="BodyText"/>
-      </w:pPr>
-      <w:r>
-        <w:t xml:space="preserve">GRAFİK (</w:t>
-      </w:r>
-      <w:r>
-        <w:rPr>
-          <w:b/>
-          <w:bCs/>
-        </w:rPr>
-        <w:t xml:space="preserve">?@fig-003</w:t>
-      </w:r>
-      <w:r>
-        <w:t xml:space="preserve">).</w:t>
-      </w:r>
-    </w:p>
-    <w:p>
-      <w:pPr>
-        <w:pStyle w:val="BodyText"/>
-      </w:pPr>
-      <w:r>
-        <w:t xml:space="preserve">(image/3.png){#fig-003 width=70%}</w:t>
-      </w:r>
-    </w:p>
-    <w:p>
-      <w:pPr>
-        <w:pStyle w:val="BodyText"/>
-      </w:pPr>
-      <w:r>
-        <w:t xml:space="preserve">GRAFİK (</w:t>
-      </w:r>
-      <w:r>
-        <w:rPr>
-          <w:b/>
-          <w:bCs/>
-        </w:rPr>
-        <w:t xml:space="preserve">?@fig-004</w:t>
-      </w:r>
-      <w:r>
-        <w:t xml:space="preserve">).</w:t>
-      </w:r>
-    </w:p>
-    <w:p>
-      <w:pPr>
-        <w:pStyle w:val="BodyText"/>
-      </w:pPr>
-      <w:r>
-        <w:t xml:space="preserve">(image/4.png){#fig-004 width=70%}</w:t>
-      </w:r>
-    </w:p>
-    <w:bookmarkEnd w:id="35"/>
-    <w:bookmarkStart w:id="36" w:name="выводы"/>
-    <w:p>
-      <w:pPr>
-        <w:pStyle w:val="Heading1"/>
-      </w:pPr>
-      <w:r>
-        <w:t xml:space="preserve">18. Выводы</w:t>
-      </w:r>
-    </w:p>
-    <w:p>
-      <w:pPr>
-        <w:pStyle w:val="FirstParagraph"/>
-      </w:pPr>
-      <w:r>
-        <w:t xml:space="preserve">В процессе выполнения данной лабораторной работы я построила математическую модель для выбора правильной стратегии при решении примера задаче о погоне.</w:t>
-      </w:r>
-    </w:p>
-    <w:p>
-      <w:pPr>
-        <w:pStyle w:val="BodyText"/>
-      </w:pPr>
-      <w:r>
         <w:t xml:space="preserve">Список литературы{.unnumbered}</w:t>
       </w:r>
       <w:r>
@@ -2367,7 +2603,7 @@
         <w:t xml:space="preserve">:::</w:t>
       </w:r>
     </w:p>
-    <w:bookmarkEnd w:id="36"/>
+    <w:bookmarkEnd w:id="52"/>
     <w:sectPr>
       <w:footnotePr>
         <w:numRestart w:val="eachSect"/>

</xml_diff>